<commit_message>
update on 2025-12-24 16:02:39.630762
</commit_message>
<xml_diff>
--- a/py - image.docx
+++ b/py - image.docx
@@ -6055,6 +6055,8 @@
           </w14:textFill>
         </w:rPr>
       </w:pPr>
+      <w:bookmarkStart w:id="10" w:name="_GoBack"/>
+      <w:bookmarkEnd w:id="10"/>
     </w:p>
     <w:tbl>
       <w:tblPr>
@@ -6079,8 +6081,8 @@
       </w:tblPr>
       <w:tblGrid>
         <w:gridCol w:w="869"/>
-        <w:gridCol w:w="4090"/>
-        <w:gridCol w:w="5636"/>
+        <w:gridCol w:w="5734"/>
+        <w:gridCol w:w="2007"/>
       </w:tblGrid>
       <w:tr>
         <w:tblPrEx>
@@ -6206,136 +6208,6 @@
               </w:rPr>
               <w:t>颜色</w:t>
             </w:r>
-            <w:r>
-              <w:rPr>
-                <w:rFonts w:hint="eastAsia"/>
-                <w:color w:val="ED7D31" w:themeColor="accent2"/>
-                <w:spacing w:val="7"/>
-                <w:lang w:val="en-US" w:eastAsia="zh-CN"/>
-                <w14:textFill>
-                  <w14:solidFill>
-                    <w14:schemeClr w14:val="accent2"/>
-                  </w14:solidFill>
-                </w14:textFill>
-              </w:rPr>
-              <w:t xml:space="preserve"> (</w:t>
-            </w:r>
-            <m:oMath>
-              <m:r>
-                <m:rPr>
-                  <m:sty m:val="b"/>
-                </m:rPr>
-                <w:rPr>
-                  <w:rFonts w:hint="default" w:ascii="Cambria Math" w:hAnsi="Cambria Math" w:cs="华文中宋"/>
-                  <w:color w:val="ED7D31" w:themeColor="accent2"/>
-                  <w:spacing w:val="7"/>
-                  <w:kern w:val="2"/>
-                  <w:sz w:val="21"/>
-                  <w:szCs w:val="21"/>
-                  <w:lang w:val="en-US" w:eastAsia="zh-CN" w:bidi="ar-SA"/>
-                  <w14:textFill>
-                    <w14:solidFill>
-                      <w14:schemeClr w14:val="accent2"/>
-                    </w14:solidFill>
-                  </w14:textFill>
-                </w:rPr>
-                <m:t>float</m:t>
-              </m:r>
-              <m:r>
-                <m:rPr>
-                  <m:sty m:val="b"/>
-                </m:rPr>
-                <w:rPr>
-                  <w:rFonts w:hint="eastAsia" w:ascii="Cambria Math" w:hAnsi="Cambria Math" w:cs="华文中宋"/>
-                  <w:color w:val="ED7D31" w:themeColor="accent2"/>
-                  <w:spacing w:val="7"/>
-                  <w:kern w:val="2"/>
-                  <w:sz w:val="21"/>
-                  <w:szCs w:val="21"/>
-                  <w:lang w:val="en-US" w:eastAsia="zh-CN" w:bidi="ar-SA"/>
-                  <w14:textFill>
-                    <w14:solidFill>
-                      <w14:schemeClr w14:val="accent2"/>
-                    </w14:solidFill>
-                  </w14:textFill>
-                </w:rPr>
-                <m:t>∈</m:t>
-              </m:r>
-              <m:r>
-                <m:rPr>
-                  <m:sty m:val="b"/>
-                </m:rPr>
-                <w:rPr>
-                  <w:rFonts w:hint="default" w:ascii="Cambria Math" w:hAnsi="Cambria Math" w:cs="华文中宋"/>
-                  <w:color w:val="ED7D31" w:themeColor="accent2"/>
-                  <w:spacing w:val="7"/>
-                  <w:kern w:val="2"/>
-                  <w:sz w:val="21"/>
-                  <w:szCs w:val="21"/>
-                  <w:lang w:val="en-US" w:eastAsia="zh-CN" w:bidi="ar-SA"/>
-                  <w14:textFill>
-                    <w14:solidFill>
-                      <w14:schemeClr w14:val="accent2"/>
-                    </w14:solidFill>
-                  </w14:textFill>
-                </w:rPr>
-                <m:t>[0, 1], int</m:t>
-              </m:r>
-              <m:r>
-                <m:rPr>
-                  <m:sty m:val="b"/>
-                </m:rPr>
-                <w:rPr>
-                  <w:rFonts w:hint="eastAsia" w:ascii="Cambria Math" w:hAnsi="Cambria Math" w:cs="华文中宋"/>
-                  <w:color w:val="ED7D31" w:themeColor="accent2"/>
-                  <w:spacing w:val="7"/>
-                  <w:kern w:val="2"/>
-                  <w:sz w:val="21"/>
-                  <w:szCs w:val="21"/>
-                  <w:lang w:val="en-US" w:eastAsia="zh-CN" w:bidi="ar-SA"/>
-                  <w14:textFill>
-                    <w14:solidFill>
-                      <w14:schemeClr w14:val="accent2"/>
-                    </w14:solidFill>
-                  </w14:textFill>
-                </w:rPr>
-                <m:t>∈</m:t>
-              </m:r>
-              <m:r>
-                <m:rPr>
-                  <m:sty m:val="b"/>
-                </m:rPr>
-                <w:rPr>
-                  <w:rFonts w:hint="default" w:ascii="Cambria Math" w:hAnsi="Cambria Math" w:cs="华文中宋"/>
-                  <w:color w:val="ED7D31" w:themeColor="accent2"/>
-                  <w:spacing w:val="7"/>
-                  <w:kern w:val="2"/>
-                  <w:sz w:val="21"/>
-                  <w:szCs w:val="21"/>
-                  <w:lang w:val="en-US" w:eastAsia="zh-CN" w:bidi="ar-SA"/>
-                  <w14:textFill>
-                    <w14:solidFill>
-                      <w14:schemeClr w14:val="accent2"/>
-                    </w14:solidFill>
-                  </w14:textFill>
-                </w:rPr>
-                <m:t>[0, obj.N)</m:t>
-              </m:r>
-            </m:oMath>
-            <w:r>
-              <w:rPr>
-                <w:rFonts w:hint="eastAsia"/>
-                <w:color w:val="ED7D31" w:themeColor="accent2"/>
-                <w:spacing w:val="7"/>
-                <w:lang w:val="en-US" w:eastAsia="zh-CN"/>
-                <w14:textFill>
-                  <w14:solidFill>
-                    <w14:schemeClr w14:val="accent2"/>
-                  </w14:solidFill>
-                </w14:textFill>
-              </w:rPr>
-              <w:t>)</w:t>
-            </w:r>
           </w:p>
         </w:tc>
       </w:tr>
@@ -6417,44 +6289,60 @@
                   </w14:solidFill>
                 </w14:textFill>
               </w:rPr>
-              <w:drawing>
-                <wp:inline distT="0" distB="0" distL="114300" distR="114300">
-                  <wp:extent cx="5294630" cy="5278755"/>
-                  <wp:effectExtent l="0" t="0" r="1270" b="17145"/>
-                  <wp:docPr id="3" name="图片 3" descr="20201018130916314"/>
-                  <wp:cNvGraphicFramePr>
-                    <a:graphicFrameLocks xmlns:a="http://schemas.openxmlformats.org/drawingml/2006/main" noChangeAspect="1"/>
-                  </wp:cNvGraphicFramePr>
-                  <a:graphic xmlns:a="http://schemas.openxmlformats.org/drawingml/2006/main">
-                    <a:graphicData uri="http://schemas.openxmlformats.org/drawingml/2006/picture">
-                      <pic:pic xmlns:pic="http://schemas.openxmlformats.org/drawingml/2006/picture">
-                        <pic:nvPicPr>
-                          <pic:cNvPr id="3" name="图片 3" descr="20201018130916314"/>
-                          <pic:cNvPicPr>
-                            <a:picLocks noChangeAspect="1"/>
-                          </pic:cNvPicPr>
-                        </pic:nvPicPr>
-                        <pic:blipFill>
-                          <a:blip r:embed="rId4"/>
-                          <a:srcRect l="4694" t="1476" r="1673" b="3700"/>
-                          <a:stretch>
-                            <a:fillRect/>
-                          </a:stretch>
-                        </pic:blipFill>
-                        <pic:spPr>
-                          <a:xfrm>
-                            <a:off x="0" y="0"/>
-                            <a:ext cx="5294630" cy="5278755"/>
-                          </a:xfrm>
-                          <a:prstGeom prst="rect">
-                            <a:avLst/>
-                          </a:prstGeom>
-                        </pic:spPr>
-                      </pic:pic>
-                    </a:graphicData>
-                  </a:graphic>
-                </wp:inline>
-              </w:drawing>
+              <w:fldChar w:fldCharType="begin"/>
+            </w:r>
+            <w:r>
+              <w:rPr>
+                <w:rFonts w:hint="eastAsia"/>
+                <w:color w:val="ED7D31" w:themeColor="accent2"/>
+                <w:spacing w:val="7"/>
+                <w14:textFill>
+                  <w14:solidFill>
+                    <w14:schemeClr w14:val="accent2"/>
+                  </w14:solidFill>
+                </w14:textFill>
+              </w:rPr>
+              <w:instrText xml:space="preserve"> HYPERLINK "https://matplotlib.org/stable/gallery/color/named_colors.html" </w:instrText>
+            </w:r>
+            <w:r>
+              <w:rPr>
+                <w:rFonts w:hint="eastAsia"/>
+                <w:color w:val="ED7D31" w:themeColor="accent2"/>
+                <w:spacing w:val="7"/>
+                <w14:textFill>
+                  <w14:solidFill>
+                    <w14:schemeClr w14:val="accent2"/>
+                  </w14:solidFill>
+                </w14:textFill>
+              </w:rPr>
+              <w:fldChar w:fldCharType="separate"/>
+            </w:r>
+            <w:r>
+              <w:rPr>
+                <w:rStyle w:val="11"/>
+                <w:rFonts w:hint="eastAsia"/>
+                <w:color w:val="ED7D31" w:themeColor="accent2"/>
+                <w:spacing w:val="7"/>
+                <w14:textFill>
+                  <w14:solidFill>
+                    <w14:schemeClr w14:val="accent2"/>
+                  </w14:solidFill>
+                </w14:textFill>
+              </w:rPr>
+              <w:t>https://matplotlib.org/stable/gallery/color/named_colors.html</w:t>
+            </w:r>
+            <w:r>
+              <w:rPr>
+                <w:rFonts w:hint="eastAsia"/>
+                <w:color w:val="ED7D31" w:themeColor="accent2"/>
+                <w:spacing w:val="7"/>
+                <w14:textFill>
+                  <w14:solidFill>
+                    <w14:schemeClr w14:val="accent2"/>
+                  </w14:solidFill>
+                </w14:textFill>
+              </w:rPr>
+              <w:fldChar w:fldCharType="end"/>
             </w:r>
           </w:p>
         </w:tc>
@@ -6482,7 +6370,6 @@
         <w:tc>
           <w:tcPr>
             <w:tcW w:w="0" w:type="auto"/>
-            <w:vMerge w:val="restart"/>
             <w:vAlign w:val="center"/>
           </w:tcPr>
           <w:p>
@@ -6511,84 +6398,6 @@
               <w:t>cmap</w:t>
             </w:r>
           </w:p>
-          <w:p>
-            <w:pPr>
-              <w:rPr>
-                <w:color w:val="ED7D31" w:themeColor="accent2"/>
-                <w:spacing w:val="7"/>
-                <w14:textFill>
-                  <w14:solidFill>
-                    <w14:schemeClr w14:val="accent2"/>
-                  </w14:solidFill>
-                </w14:textFill>
-              </w:rPr>
-            </w:pPr>
-            <w:r>
-              <w:rPr>
-                <w:rFonts w:hint="eastAsia"/>
-                <w:color w:val="ED7D31" w:themeColor="accent2"/>
-                <w:spacing w:val="7"/>
-                <w14:textFill>
-                  <w14:solidFill>
-                    <w14:schemeClr w14:val="accent2"/>
-                  </w14:solidFill>
-                </w14:textFill>
-              </w:rPr>
-              <w:t>(_r</w:t>
-            </w:r>
-          </w:p>
-          <w:p>
-            <w:pPr>
-              <w:rPr>
-                <w:color w:val="ED7D31" w:themeColor="accent2"/>
-                <w:spacing w:val="7"/>
-                <w14:textFill>
-                  <w14:solidFill>
-                    <w14:schemeClr w14:val="accent2"/>
-                  </w14:solidFill>
-                </w14:textFill>
-              </w:rPr>
-            </w:pPr>
-            <w:r>
-              <w:rPr>
-                <w:rFonts w:hint="eastAsia"/>
-                <w:color w:val="ED7D31" w:themeColor="accent2"/>
-                <w:spacing w:val="7"/>
-                <w14:textFill>
-                  <w14:solidFill>
-                    <w14:schemeClr w14:val="accent2"/>
-                  </w14:solidFill>
-                </w14:textFill>
-              </w:rPr>
-              <w:t xml:space="preserve">后缀 </w:t>
-            </w:r>
-          </w:p>
-          <w:p>
-            <w:pPr>
-              <w:rPr>
-                <w:color w:val="ED7D31" w:themeColor="accent2"/>
-                <w:spacing w:val="7"/>
-                <w14:textFill>
-                  <w14:solidFill>
-                    <w14:schemeClr w14:val="accent2"/>
-                  </w14:solidFill>
-                </w14:textFill>
-              </w:rPr>
-            </w:pPr>
-            <w:r>
-              <w:rPr>
-                <w:rFonts w:hint="eastAsia"/>
-                <w:color w:val="ED7D31" w:themeColor="accent2"/>
-                <w:spacing w:val="7"/>
-                <w14:textFill>
-                  <w14:solidFill>
-                    <w14:schemeClr w14:val="accent2"/>
-                  </w14:solidFill>
-                </w14:textFill>
-              </w:rPr>
-              <w:t>反转)</w:t>
-            </w:r>
-          </w:p>
         </w:tc>
         <w:tc>
           <w:tcPr>
@@ -6610,342 +6419,69 @@
             </w:pPr>
             <w:r>
               <w:rPr>
-                <w:rFonts w:ascii="宋体" w:hAnsi="宋体" w:eastAsia="宋体" w:cs="宋体"/>
-                <w:sz w:val="24"/>
-                <w:szCs w:val="24"/>
-              </w:rPr>
-              <w:drawing>
-                <wp:inline distT="0" distB="0" distL="114300" distR="114300">
-                  <wp:extent cx="2944495" cy="607060"/>
-                  <wp:effectExtent l="0" t="0" r="8255" b="2540"/>
-                  <wp:docPr id="1" name="图片 1" descr="IMG_256"/>
-                  <wp:cNvGraphicFramePr>
-                    <a:graphicFrameLocks xmlns:a="http://schemas.openxmlformats.org/drawingml/2006/main" noChangeAspect="1"/>
-                  </wp:cNvGraphicFramePr>
-                  <a:graphic xmlns:a="http://schemas.openxmlformats.org/drawingml/2006/main">
-                    <a:graphicData uri="http://schemas.openxmlformats.org/drawingml/2006/picture">
-                      <pic:pic xmlns:pic="http://schemas.openxmlformats.org/drawingml/2006/picture">
-                        <pic:nvPicPr>
-                          <pic:cNvPr id="1" name="图片 1" descr="IMG_256"/>
-                          <pic:cNvPicPr>
-                            <a:picLocks noChangeAspect="1"/>
-                          </pic:cNvPicPr>
-                        </pic:nvPicPr>
-                        <pic:blipFill>
-                          <a:blip r:embed="rId5"/>
-                          <a:srcRect l="2064" t="20388"/>
-                          <a:stretch>
-                            <a:fillRect/>
-                          </a:stretch>
-                        </pic:blipFill>
-                        <pic:spPr>
-                          <a:xfrm>
-                            <a:off x="0" y="0"/>
-                            <a:ext cx="2944495" cy="607060"/>
-                          </a:xfrm>
-                          <a:prstGeom prst="rect">
-                            <a:avLst/>
-                          </a:prstGeom>
-                          <a:noFill/>
-                          <a:ln w="9525">
-                            <a:noFill/>
-                          </a:ln>
-                        </pic:spPr>
-                      </pic:pic>
-                    </a:graphicData>
-                  </a:graphic>
-                </wp:inline>
-              </w:drawing>
-            </w:r>
-          </w:p>
-        </w:tc>
-      </w:tr>
-      <w:tr>
-        <w:tblPrEx>
-          <w:tblBorders>
-            <w:top w:val="single" w:color="auto" w:sz="4" w:space="0"/>
-            <w:left w:val="single" w:color="auto" w:sz="4" w:space="0"/>
-            <w:bottom w:val="single" w:color="auto" w:sz="4" w:space="0"/>
-            <w:right w:val="single" w:color="auto" w:sz="4" w:space="0"/>
-            <w:insideH w:val="single" w:color="auto" w:sz="4" w:space="0"/>
-            <w:insideV w:val="single" w:color="auto" w:sz="4" w:space="0"/>
-          </w:tblBorders>
-          <w:tblCellMar>
-            <w:top w:w="0" w:type="dxa"/>
-            <w:left w:w="108" w:type="dxa"/>
-            <w:bottom w:w="0" w:type="dxa"/>
-            <w:right w:w="108" w:type="dxa"/>
-          </w:tblCellMar>
-        </w:tblPrEx>
-        <w:trPr>
-          <w:trHeight w:val="156" w:hRule="atLeast"/>
-        </w:trPr>
-        <w:tc>
-          <w:tcPr>
-            <w:tcW w:w="0" w:type="auto"/>
-            <w:vMerge w:val="continue"/>
-            <w:vAlign w:val="center"/>
-          </w:tcPr>
-          <w:p/>
-        </w:tc>
-        <w:tc>
-          <w:tcPr>
-            <w:tcW w:w="0" w:type="auto"/>
-            <w:gridSpan w:val="2"/>
-            <w:vAlign w:val="center"/>
-          </w:tcPr>
-          <w:p>
-            <w:pPr>
-              <w:rPr>
-                <w:color w:val="ED7D31" w:themeColor="accent2"/>
-                <w:spacing w:val="7"/>
-                <w14:textFill>
-                  <w14:solidFill>
-                    <w14:schemeClr w14:val="accent2"/>
-                  </w14:solidFill>
-                </w14:textFill>
-              </w:rPr>
-            </w:pPr>
-            <w:r>
-              <w:rPr>
-                <w:rFonts w:ascii="宋体" w:hAnsi="宋体" w:eastAsia="宋体" w:cs="宋体"/>
-                <w:sz w:val="24"/>
-                <w:szCs w:val="24"/>
-              </w:rPr>
-              <w:drawing>
-                <wp:inline distT="0" distB="0" distL="114300" distR="114300">
-                  <wp:extent cx="2897505" cy="1633220"/>
-                  <wp:effectExtent l="0" t="0" r="17145" b="5080"/>
-                  <wp:docPr id="8" name="图片 4" descr="IMG_256"/>
-                  <wp:cNvGraphicFramePr>
-                    <a:graphicFrameLocks xmlns:a="http://schemas.openxmlformats.org/drawingml/2006/main" noChangeAspect="1"/>
-                  </wp:cNvGraphicFramePr>
-                  <a:graphic xmlns:a="http://schemas.openxmlformats.org/drawingml/2006/main">
-                    <a:graphicData uri="http://schemas.openxmlformats.org/drawingml/2006/picture">
-                      <pic:pic xmlns:pic="http://schemas.openxmlformats.org/drawingml/2006/picture">
-                        <pic:nvPicPr>
-                          <pic:cNvPr id="8" name="图片 4" descr="IMG_256"/>
-                          <pic:cNvPicPr>
-                            <a:picLocks noChangeAspect="1"/>
-                          </pic:cNvPicPr>
-                        </pic:nvPicPr>
-                        <pic:blipFill>
-                          <a:blip r:embed="rId6"/>
-                          <a:srcRect l="445" t="7899" r="7280" b="3380"/>
-                          <a:stretch>
-                            <a:fillRect/>
-                          </a:stretch>
-                        </pic:blipFill>
-                        <pic:spPr>
-                          <a:xfrm>
-                            <a:off x="0" y="0"/>
-                            <a:ext cx="2897505" cy="1633220"/>
-                          </a:xfrm>
-                          <a:prstGeom prst="rect">
-                            <a:avLst/>
-                          </a:prstGeom>
-                          <a:noFill/>
-                          <a:ln w="9525">
-                            <a:noFill/>
-                          </a:ln>
-                        </pic:spPr>
-                      </pic:pic>
-                    </a:graphicData>
-                  </a:graphic>
-                </wp:inline>
-              </w:drawing>
-            </w:r>
-            <w:r>
-              <w:rPr>
-                <w:rFonts w:ascii="宋体" w:hAnsi="宋体" w:eastAsia="宋体" w:cs="宋体"/>
-                <w:sz w:val="24"/>
-                <w:szCs w:val="24"/>
-              </w:rPr>
-              <w:drawing>
-                <wp:inline distT="0" distB="0" distL="114300" distR="114300">
-                  <wp:extent cx="2918460" cy="1673225"/>
-                  <wp:effectExtent l="0" t="0" r="15240" b="3175"/>
-                  <wp:docPr id="9" name="图片 5" descr="IMG_256"/>
-                  <wp:cNvGraphicFramePr>
-                    <a:graphicFrameLocks xmlns:a="http://schemas.openxmlformats.org/drawingml/2006/main" noChangeAspect="1"/>
-                  </wp:cNvGraphicFramePr>
-                  <a:graphic xmlns:a="http://schemas.openxmlformats.org/drawingml/2006/main">
-                    <a:graphicData uri="http://schemas.openxmlformats.org/drawingml/2006/picture">
-                      <pic:pic xmlns:pic="http://schemas.openxmlformats.org/drawingml/2006/picture">
-                        <pic:nvPicPr>
-                          <pic:cNvPr id="9" name="图片 5" descr="IMG_256"/>
-                          <pic:cNvPicPr>
-                            <a:picLocks noChangeAspect="1"/>
-                          </pic:cNvPicPr>
-                        </pic:nvPicPr>
-                        <pic:blipFill>
-                          <a:blip r:embed="rId7"/>
-                          <a:srcRect l="3741" t="8878" r="3316" b="1830"/>
-                          <a:stretch>
-                            <a:fillRect/>
-                          </a:stretch>
-                        </pic:blipFill>
-                        <pic:spPr>
-                          <a:xfrm>
-                            <a:off x="0" y="0"/>
-                            <a:ext cx="2918460" cy="1673225"/>
-                          </a:xfrm>
-                          <a:prstGeom prst="rect">
-                            <a:avLst/>
-                          </a:prstGeom>
-                          <a:noFill/>
-                          <a:ln w="9525">
-                            <a:noFill/>
-                          </a:ln>
-                        </pic:spPr>
-                      </pic:pic>
-                    </a:graphicData>
-                  </a:graphic>
-                </wp:inline>
-              </w:drawing>
-            </w:r>
-          </w:p>
-        </w:tc>
-      </w:tr>
-      <w:tr>
-        <w:tblPrEx>
-          <w:tblBorders>
-            <w:top w:val="single" w:color="auto" w:sz="4" w:space="0"/>
-            <w:left w:val="single" w:color="auto" w:sz="4" w:space="0"/>
-            <w:bottom w:val="single" w:color="auto" w:sz="4" w:space="0"/>
-            <w:right w:val="single" w:color="auto" w:sz="4" w:space="0"/>
-            <w:insideH w:val="single" w:color="auto" w:sz="4" w:space="0"/>
-            <w:insideV w:val="single" w:color="auto" w:sz="4" w:space="0"/>
-          </w:tblBorders>
-          <w:tblCellMar>
-            <w:top w:w="0" w:type="dxa"/>
-            <w:left w:w="108" w:type="dxa"/>
-            <w:bottom w:w="0" w:type="dxa"/>
-            <w:right w:w="108" w:type="dxa"/>
-          </w:tblCellMar>
-        </w:tblPrEx>
-        <w:trPr>
-          <w:trHeight w:val="156" w:hRule="atLeast"/>
-        </w:trPr>
-        <w:tc>
-          <w:tcPr>
-            <w:tcW w:w="0" w:type="auto"/>
-            <w:vMerge w:val="continue"/>
-            <w:vAlign w:val="center"/>
-          </w:tcPr>
-          <w:p/>
-        </w:tc>
-        <w:tc>
-          <w:tcPr>
-            <w:tcW w:w="0" w:type="auto"/>
-            <w:gridSpan w:val="2"/>
-            <w:vAlign w:val="center"/>
-          </w:tcPr>
-          <w:p>
-            <w:pPr>
-              <w:rPr>
-                <w:rFonts w:ascii="宋体" w:hAnsi="宋体" w:eastAsia="宋体" w:cs="宋体"/>
-                <w:sz w:val="24"/>
-                <w:szCs w:val="24"/>
-              </w:rPr>
-            </w:pPr>
-            <w:r>
-              <w:rPr>
-                <w:rFonts w:ascii="宋体" w:hAnsi="宋体" w:eastAsia="宋体" w:cs="宋体"/>
-                <w:sz w:val="24"/>
-                <w:szCs w:val="24"/>
-              </w:rPr>
-              <w:drawing>
-                <wp:inline distT="0" distB="0" distL="114300" distR="114300">
-                  <wp:extent cx="2894965" cy="2461895"/>
-                  <wp:effectExtent l="0" t="0" r="635" b="14605"/>
-                  <wp:docPr id="2" name="图片 2" descr="IMG_256"/>
-                  <wp:cNvGraphicFramePr>
-                    <a:graphicFrameLocks xmlns:a="http://schemas.openxmlformats.org/drawingml/2006/main" noChangeAspect="1"/>
-                  </wp:cNvGraphicFramePr>
-                  <a:graphic xmlns:a="http://schemas.openxmlformats.org/drawingml/2006/main">
-                    <a:graphicData uri="http://schemas.openxmlformats.org/drawingml/2006/picture">
-                      <pic:pic xmlns:pic="http://schemas.openxmlformats.org/drawingml/2006/picture">
-                        <pic:nvPicPr>
-                          <pic:cNvPr id="2" name="图片 2" descr="IMG_256"/>
-                          <pic:cNvPicPr>
-                            <a:picLocks noChangeAspect="1"/>
-                          </pic:cNvPicPr>
-                        </pic:nvPicPr>
-                        <pic:blipFill>
-                          <a:blip r:embed="rId8"/>
-                          <a:srcRect l="3951" t="4874" r="6650" b="1320"/>
-                          <a:stretch>
-                            <a:fillRect/>
-                          </a:stretch>
-                        </pic:blipFill>
-                        <pic:spPr>
-                          <a:xfrm>
-                            <a:off x="0" y="0"/>
-                            <a:ext cx="2894965" cy="2461895"/>
-                          </a:xfrm>
-                          <a:prstGeom prst="rect">
-                            <a:avLst/>
-                          </a:prstGeom>
-                          <a:noFill/>
-                          <a:ln w="9525">
-                            <a:noFill/>
-                          </a:ln>
-                        </pic:spPr>
-                      </pic:pic>
-                    </a:graphicData>
-                  </a:graphic>
-                </wp:inline>
-              </w:drawing>
-            </w:r>
-            <w:r>
-              <w:rPr>
-                <w:rFonts w:ascii="宋体" w:hAnsi="宋体" w:eastAsia="宋体" w:cs="宋体"/>
-                <w:sz w:val="24"/>
-                <w:szCs w:val="24"/>
-              </w:rPr>
-              <w:drawing>
-                <wp:inline distT="0" distB="0" distL="114300" distR="114300">
-                  <wp:extent cx="3138805" cy="2416175"/>
-                  <wp:effectExtent l="0" t="0" r="4445" b="3175"/>
-                  <wp:docPr id="4" name="图片 3" descr="IMG_256"/>
-                  <wp:cNvGraphicFramePr>
-                    <a:graphicFrameLocks xmlns:a="http://schemas.openxmlformats.org/drawingml/2006/main" noChangeAspect="1"/>
-                  </wp:cNvGraphicFramePr>
-                  <a:graphic xmlns:a="http://schemas.openxmlformats.org/drawingml/2006/main">
-                    <a:graphicData uri="http://schemas.openxmlformats.org/drawingml/2006/picture">
-                      <pic:pic xmlns:pic="http://schemas.openxmlformats.org/drawingml/2006/picture">
-                        <pic:nvPicPr>
-                          <pic:cNvPr id="4" name="图片 3" descr="IMG_256"/>
-                          <pic:cNvPicPr>
-                            <a:picLocks noChangeAspect="1"/>
-                          </pic:cNvPicPr>
-                        </pic:nvPicPr>
-                        <pic:blipFill>
-                          <a:blip r:embed="rId9"/>
-                          <a:srcRect l="4231" t="5834" r="7057"/>
-                          <a:stretch>
-                            <a:fillRect/>
-                          </a:stretch>
-                        </pic:blipFill>
-                        <pic:spPr>
-                          <a:xfrm>
-                            <a:off x="0" y="0"/>
-                            <a:ext cx="3138805" cy="2416175"/>
-                          </a:xfrm>
-                          <a:prstGeom prst="rect">
-                            <a:avLst/>
-                          </a:prstGeom>
-                          <a:noFill/>
-                          <a:ln w="9525">
-                            <a:noFill/>
-                          </a:ln>
-                        </pic:spPr>
-                      </pic:pic>
-                    </a:graphicData>
-                  </a:graphic>
-                </wp:inline>
-              </w:drawing>
+                <w:rFonts w:hint="eastAsia"/>
+                <w:color w:val="ED7D31" w:themeColor="accent2"/>
+                <w:spacing w:val="7"/>
+                <w14:textFill>
+                  <w14:solidFill>
+                    <w14:schemeClr w14:val="accent2"/>
+                  </w14:solidFill>
+                </w14:textFill>
+              </w:rPr>
+              <w:fldChar w:fldCharType="begin"/>
+            </w:r>
+            <w:r>
+              <w:rPr>
+                <w:rFonts w:hint="eastAsia"/>
+                <w:color w:val="ED7D31" w:themeColor="accent2"/>
+                <w:spacing w:val="7"/>
+                <w14:textFill>
+                  <w14:solidFill>
+                    <w14:schemeClr w14:val="accent2"/>
+                  </w14:solidFill>
+                </w14:textFill>
+              </w:rPr>
+              <w:instrText xml:space="preserve"> HYPERLINK "https://matplotlib.org/stable/users/explain/colors/colormaps.html" </w:instrText>
+            </w:r>
+            <w:r>
+              <w:rPr>
+                <w:rFonts w:hint="eastAsia"/>
+                <w:color w:val="ED7D31" w:themeColor="accent2"/>
+                <w:spacing w:val="7"/>
+                <w14:textFill>
+                  <w14:solidFill>
+                    <w14:schemeClr w14:val="accent2"/>
+                  </w14:solidFill>
+                </w14:textFill>
+              </w:rPr>
+              <w:fldChar w:fldCharType="separate"/>
+            </w:r>
+            <w:r>
+              <w:rPr>
+                <w:rStyle w:val="11"/>
+                <w:rFonts w:hint="eastAsia"/>
+                <w:color w:val="ED7D31" w:themeColor="accent2"/>
+                <w:spacing w:val="7"/>
+                <w14:textFill>
+                  <w14:solidFill>
+                    <w14:schemeClr w14:val="accent2"/>
+                  </w14:solidFill>
+                </w14:textFill>
+              </w:rPr>
+              <w:t>https://matplotlib.org/stable/users/explain/colors/colormaps.html</w:t>
+            </w:r>
+            <w:r>
+              <w:rPr>
+                <w:rFonts w:hint="eastAsia"/>
+                <w:color w:val="ED7D31" w:themeColor="accent2"/>
+                <w:spacing w:val="7"/>
+                <w14:textFill>
+                  <w14:solidFill>
+                    <w14:schemeClr w14:val="accent2"/>
+                  </w14:solidFill>
+                </w14:textFill>
+              </w:rPr>
+              <w:fldChar w:fldCharType="end"/>
             </w:r>
           </w:p>
         </w:tc>
@@ -14537,8 +14073,8 @@
           </w14:textFill>
         </w:rPr>
       </w:pPr>
-      <w:bookmarkStart w:id="7" w:name="_Toc12943"/>
-      <w:bookmarkStart w:id="8" w:name="_Toc26600"/>
+      <w:bookmarkStart w:id="7" w:name="_Toc26600"/>
+      <w:bookmarkStart w:id="8" w:name="_Toc12943"/>
       <w:r>
         <w:rPr>
           <w:rFonts w:hint="eastAsia"/>
@@ -16832,10 +16368,7 @@
         </w:tc>
       </w:tr>
     </w:tbl>
-    <w:p>
-      <w:bookmarkStart w:id="10" w:name="_GoBack"/>
-      <w:bookmarkEnd w:id="10"/>
-    </w:p>
+    <w:p/>
     <w:tbl>
       <w:tblPr>
         <w:tblStyle w:val="9"/>
@@ -17156,7 +16689,6 @@
           <w:tcPr>
             <w:tcW w:w="0" w:type="auto"/>
             <w:vMerge w:val="continue"/>
-            <w:tcBorders/>
             <w:vAlign w:val="center"/>
           </w:tcPr>
           <w:p>
@@ -17245,7 +16777,6 @@
           <w:tcPr>
             <w:tcW w:w="0" w:type="auto"/>
             <w:vMerge w:val="continue"/>
-            <w:tcBorders/>
             <w:vAlign w:val="center"/>
           </w:tcPr>
           <w:p>
@@ -17334,7 +16865,6 @@
           <w:tcPr>
             <w:tcW w:w="0" w:type="auto"/>
             <w:vMerge w:val="continue"/>
-            <w:tcBorders/>
             <w:vAlign w:val="center"/>
           </w:tcPr>
           <w:p>
@@ -20587,7 +20117,7 @@
   <w:style w:type="paragraph" w:styleId="3">
     <w:name w:val="footer"/>
     <w:basedOn w:val="1"/>
-    <w:link w:val="19"/>
+    <w:link w:val="20"/>
     <w:qFormat/>
     <w:uiPriority w:val="0"/>
     <w:pPr>
@@ -20606,7 +20136,7 @@
   <w:style w:type="paragraph" w:styleId="4">
     <w:name w:val="header"/>
     <w:basedOn w:val="1"/>
-    <w:link w:val="18"/>
+    <w:link w:val="19"/>
     <w:autoRedefine/>
     <w:qFormat/>
     <w:uiPriority w:val="0"/>
@@ -20700,6 +20230,15 @@
     </w:tblPr>
   </w:style>
   <w:style w:type="character" w:styleId="11">
+    <w:name w:val="FollowedHyperlink"/>
+    <w:basedOn w:val="10"/>
+    <w:uiPriority w:val="0"/>
+    <w:rPr>
+      <w:color w:val="800080"/>
+      <w:u w:val="single"/>
+    </w:rPr>
+  </w:style>
+  <w:style w:type="character" w:styleId="12">
     <w:name w:val="Hyperlink"/>
     <w:basedOn w:val="10"/>
     <w:autoRedefine/>
@@ -20716,7 +20255,7 @@
       </w14:textFill>
     </w:rPr>
   </w:style>
-  <w:style w:type="paragraph" w:customStyle="1" w:styleId="12">
+  <w:style w:type="paragraph" w:customStyle="1" w:styleId="13">
     <w:name w:val="1级标题"/>
     <w:basedOn w:val="1"/>
     <w:qFormat/>
@@ -20734,7 +20273,7 @@
       </w14:textFill>
     </w:rPr>
   </w:style>
-  <w:style w:type="paragraph" w:customStyle="1" w:styleId="13">
+  <w:style w:type="paragraph" w:customStyle="1" w:styleId="14">
     <w:name w:val="2级标题"/>
     <w:basedOn w:val="1"/>
     <w:autoRedefine/>
@@ -20749,7 +20288,7 @@
       <w:spacing w:val="7"/>
     </w:rPr>
   </w:style>
-  <w:style w:type="paragraph" w:customStyle="1" w:styleId="14">
+  <w:style w:type="paragraph" w:customStyle="1" w:styleId="15">
     <w:name w:val="3级标题"/>
     <w:basedOn w:val="1"/>
     <w:autoRedefine/>
@@ -20764,7 +20303,7 @@
       <w:spacing w:val="7"/>
     </w:rPr>
   </w:style>
-  <w:style w:type="paragraph" w:customStyle="1" w:styleId="15">
+  <w:style w:type="paragraph" w:customStyle="1" w:styleId="16">
     <w:name w:val="笔记：关键词"/>
     <w:basedOn w:val="1"/>
     <w:autoRedefine/>
@@ -20775,7 +20314,7 @@
       <w:color w:val="EA82E5"/>
     </w:rPr>
   </w:style>
-  <w:style w:type="paragraph" w:customStyle="1" w:styleId="16">
+  <w:style w:type="paragraph" w:customStyle="1" w:styleId="17">
     <w:name w:val="笔记：要点"/>
     <w:basedOn w:val="1"/>
     <w:autoRedefine/>
@@ -20786,7 +20325,7 @@
       <w:color w:val="FF0000"/>
     </w:rPr>
   </w:style>
-  <w:style w:type="paragraph" w:customStyle="1" w:styleId="17">
+  <w:style w:type="paragraph" w:customStyle="1" w:styleId="18">
     <w:name w:val="笔记：正文"/>
     <w:basedOn w:val="1"/>
     <w:autoRedefine/>
@@ -20802,7 +20341,7 @@
       </w14:textFill>
     </w:rPr>
   </w:style>
-  <w:style w:type="character" w:customStyle="1" w:styleId="18">
+  <w:style w:type="character" w:customStyle="1" w:styleId="19">
     <w:name w:val="页眉 字符"/>
     <w:basedOn w:val="10"/>
     <w:link w:val="4"/>
@@ -20824,7 +20363,7 @@
       </w14:textFill>
     </w:rPr>
   </w:style>
-  <w:style w:type="character" w:customStyle="1" w:styleId="19">
+  <w:style w:type="character" w:customStyle="1" w:styleId="20">
     <w:name w:val="页脚 字符"/>
     <w:basedOn w:val="10"/>
     <w:link w:val="3"/>

</xml_diff>

<commit_message>
update on 2026-01-15 15:26:25.741839
</commit_message>
<xml_diff>
--- a/py - image.docx
+++ b/py - image.docx
@@ -177,12 +177,6 @@
             <w:insideH w:val="single" w:color="auto" w:sz="4" w:space="0"/>
             <w:insideV w:val="single" w:color="auto" w:sz="4" w:space="0"/>
           </w:tblBorders>
-          <w:tblCellMar>
-            <w:top w:w="0" w:type="dxa"/>
-            <w:left w:w="108" w:type="dxa"/>
-            <w:bottom w:w="0" w:type="dxa"/>
-            <w:right w:w="108" w:type="dxa"/>
-          </w:tblCellMar>
         </w:tblPrEx>
         <w:tc>
           <w:tcPr>
@@ -1570,12 +1564,6 @@
             <w:insideH w:val="single" w:color="auto" w:sz="4" w:space="0"/>
             <w:insideV w:val="single" w:color="auto" w:sz="4" w:space="0"/>
           </w:tblBorders>
-          <w:tblCellMar>
-            <w:top w:w="0" w:type="dxa"/>
-            <w:left w:w="108" w:type="dxa"/>
-            <w:bottom w:w="0" w:type="dxa"/>
-            <w:right w:w="108" w:type="dxa"/>
-          </w:tblCellMar>
         </w:tblPrEx>
         <w:tc>
           <w:tcPr>
@@ -4627,8 +4615,10 @@
     <w:p>
       <w:pPr>
         <w:rPr>
+          <w:rFonts w:hint="eastAsia" w:eastAsia="华文中宋"/>
           <w:color w:val="70AD47" w:themeColor="accent6"/>
           <w:spacing w:val="7"/>
+          <w:lang w:eastAsia="zh-CN"/>
           <w14:textFill>
             <w14:solidFill>
               <w14:schemeClr w14:val="accent6"/>
@@ -4636,6 +4626,8 @@
           </w14:textFill>
         </w:rPr>
       </w:pPr>
+      <w:bookmarkStart w:id="10" w:name="_GoBack"/>
+      <w:bookmarkEnd w:id="10"/>
     </w:p>
     <w:p>
       <w:pPr>
@@ -5235,12 +5227,6 @@
             <w:insideH w:val="single" w:color="auto" w:sz="4" w:space="0"/>
             <w:insideV w:val="single" w:color="auto" w:sz="4" w:space="0"/>
           </w:tblBorders>
-          <w:tblCellMar>
-            <w:top w:w="0" w:type="dxa"/>
-            <w:left w:w="108" w:type="dxa"/>
-            <w:bottom w:w="0" w:type="dxa"/>
-            <w:right w:w="108" w:type="dxa"/>
-          </w:tblCellMar>
         </w:tblPrEx>
         <w:trPr>
           <w:trHeight w:val="156" w:hRule="atLeast"/>
@@ -6055,8 +6041,6 @@
           </w14:textFill>
         </w:rPr>
       </w:pPr>
-      <w:bookmarkStart w:id="10" w:name="_GoBack"/>
-      <w:bookmarkEnd w:id="10"/>
     </w:p>
     <w:tbl>
       <w:tblPr>
@@ -18895,6 +18879,12 @@
             <w:insideH w:val="single" w:color="auto" w:sz="4" w:space="0"/>
             <w:insideV w:val="single" w:color="auto" w:sz="4" w:space="0"/>
           </w:tblBorders>
+          <w:tblCellMar>
+            <w:top w:w="0" w:type="dxa"/>
+            <w:left w:w="108" w:type="dxa"/>
+            <w:bottom w:w="0" w:type="dxa"/>
+            <w:right w:w="108" w:type="dxa"/>
+          </w:tblCellMar>
         </w:tblPrEx>
         <w:tc>
           <w:tcPr>

</xml_diff>